<commit_message>
Point the proposal at the product design project
The brief existed on the delivery site but nothing in the proposal led to it,
so the only person who would find it is someone already looking. It now has a
section of its own, "Beyond this engagement", between the workstreams and the
first 30 days, with a live link to /product-design-brief.

It says three things plainly: why those two items are briefs rather than the
work, that the project runs alongside this engagement and is quoted
separately, and that this proposal still delivers both briefs at six months.
Nothing about scope or fees moves, and the section says so rather than
leaving the reader to work it out.

Mirrored into the docx and the deck, which the page's own download cards
serve. The deck gains one slide before Part 03.

Co-Authored-By: Claude Opus 5 <noreply@anthropic.com>
Claude-Session: https://claude.ai/code/session_01Asjqk2CJhNThgugfeWzXnb
</commit_message>
<xml_diff>
--- a/00 Admin/04 Commercial + SOW/JP_TapThat_Proposal_v03.docx
+++ b/00 Admin/04 Commercial + SOW/JP_TapThat_Proposal_v03.docx
@@ -6180,6 +6180,112 @@
         </w:tc>
       </w:tr>
     </w:tbl>
+    <w:p>
+      <w:pPr>
+        <w:keepNext/>
+        <w:spacing w:after="160" w:before="360"/>
+      </w:pPr>
+      <w:r>
+        <w:rPr>
+          <w:rFonts w:ascii="Poppins" w:cs="Poppins" w:eastAsia="Poppins" w:hAnsi="Poppins"/>
+          <w:b/>
+          <w:bCs/>
+          <w:color w:val="0066FF"/>
+          <w:sz w:val="28"/>
+          <w:szCs w:val="28"/>
+        </w:rPr>
+        <w:t xml:space="preserve">Beyond This Engagement</w:t>
+      </w:r>
+    </w:p>
+    <w:p>
+      <w:pPr>
+        <w:spacing w:after="120" w:line="360"/>
+      </w:pPr>
+      <w:r>
+        <w:rPr>
+          <w:rFonts w:ascii="Poppins" w:cs="Poppins" w:eastAsia="Poppins" w:hAnsi="Poppins"/>
+          <w:color w:val="000000"/>
+          <w:sz w:val="22"/>
+          <w:szCs w:val="22"/>
+        </w:rPr>
+        <w:t xml:space="preserve">Two items in workstream 6 are briefs rather than the work itself: designing for her, and the unit as an object worth owning. That is deliberate. Writing a brief is a month. Acting on one is product and industrial design, with different people in it and a different order of spend, and it deserves its own decision rather than being absorbed into a marketing retainer.</w:t>
+      </w:r>
+    </w:p>
+    <w:p>
+      <w:pPr>
+        <w:spacing w:after="120" w:line="360"/>
+      </w:pPr>
+      <w:r>
+        <w:rPr>
+          <w:rFonts w:ascii="Poppins" w:cs="Poppins" w:eastAsia="Poppins" w:hAnsi="Poppins"/>
+          <w:color w:val="000000"/>
+          <w:sz w:val="22"/>
+          <w:szCs w:val="22"/>
+        </w:rPr>
+        <w:t xml:space="preserve">Both are scoped as a separate project in the </w:t>
+      </w:r>
+      <w:r>
+        <w:rPr>
+          <w:rFonts w:ascii="Poppins" w:cs="Poppins" w:eastAsia="Poppins" w:hAnsi="Poppins"/>
+          <w:b/>
+          <w:bCs/>
+          <w:color w:val="000000"/>
+          <w:sz w:val="22"/>
+          <w:szCs w:val="22"/>
+        </w:rPr>
+        <w:t xml:space="preserve">Product Design Brief</w:t>
+      </w:r>
+      <w:r>
+        <w:rPr>
+          <w:rFonts w:ascii="Poppins" w:cs="Poppins" w:eastAsia="Poppins" w:hAnsi="Poppins"/>
+          <w:color w:val="000000"/>
+          <w:sz w:val="22"/>
+          <w:szCs w:val="22"/>
+        </w:rPr>
+        <w:t xml:space="preserve">, catalogue #78, on the delivery site at /product-design-brief. It covers the range designed for her and the hardware as something worth owning, in four stages with a stop-or-continue point at each, and nothing in it commits to manufacturing before demand has been tested.</w:t>
+      </w:r>
+    </w:p>
+    <w:p>
+      <w:pPr>
+        <w:spacing w:after="120" w:line="360"/>
+      </w:pPr>
+      <w:r>
+        <w:rPr>
+          <w:rFonts w:ascii="Poppins" w:cs="Poppins" w:eastAsia="Poppins" w:hAnsi="Poppins"/>
+          <w:b/>
+          <w:bCs/>
+          <w:color w:val="000000"/>
+          <w:sz w:val="22"/>
+          <w:szCs w:val="22"/>
+        </w:rPr>
+        <w:t xml:space="preserve">It runs alongside this engagement, not inside it. </w:t>
+      </w:r>
+      <w:r>
+        <w:rPr>
+          <w:rFonts w:ascii="Poppins" w:cs="Poppins" w:eastAsia="Poppins" w:hAnsi="Poppins"/>
+          <w:color w:val="000000"/>
+          <w:sz w:val="22"/>
+          <w:szCs w:val="22"/>
+        </w:rPr>
+        <w:t xml:space="preserve">It is quoted separately, and nothing in it changes what is covered here or what it costs. This proposal still delivers both briefs at six months. The separate project is what they grow into if you want them to.</w:t>
+      </w:r>
+    </w:p>
+    <w:p>
+      <w:pPr>
+        <w:spacing w:after="120" w:line="360"/>
+      </w:pPr>
+      <w:r>
+        <w:rPr>
+          <w:rFonts w:ascii="Poppins" w:cs="Poppins" w:eastAsia="Poppins" w:hAnsi="Poppins"/>
+          <w:i/>
+          <w:iCs/>
+          <w:color w:val="000000"/>
+          <w:sz w:val="22"/>
+          <w:szCs w:val="22"/>
+        </w:rPr>
+        <w:t xml:space="preserve">– Read it when you are ready to decide on it, not before. The decision it needs first is whether Tap That makes hardware, specifies it with a manufacturer, or licences the design.</w:t>
+      </w:r>
+    </w:p>
     <w:p>
       <w:pPr>
         <w:keepNext/>

</xml_diff>

<commit_message>
Remove the itemised inclusions from both options
Scope is not settled, so the line-item breakdown is removed from Option A
and Option B. Each option now shows its total, its payment terms and
"Inclusions to be confirmed".

Carried through the markdown, the docx, the deck and the page. The deck
stopped parsing the four line fees it no longer prints, so a figure it
cannot show can no longer break the build. The Option A payment note lost
its closing clause, which described line fees that are no longer there.

Co-Authored-By: Claude Opus 5 <noreply@anthropic.com>
Claude-Session: https://claude.ai/code/session_01Asjqk2CJhNThgugfeWzXnb
</commit_message>
<xml_diff>
--- a/00 Admin/04 Commercial + SOW/JP_TapThat_Proposal_v03.docx
+++ b/00 Admin/04 Commercial + SOW/JP_TapThat_Proposal_v03.docx
@@ -3972,7 +3972,7 @@
               </w:rPr>
               <w:t xml:space="preserve">Creator plan: </w:t>
             </w:r>
-            <w:hyperlink w:history="1" r:id="rIdirbaabkc-j1pyq6ijt6sh">
+            <w:hyperlink w:history="1" r:id="rIdvg_fxqr75bzwqi6n7ycdw">
               <w:r>
                 <w:rPr>
                   <w:rFonts w:ascii="Poppins" w:cs="Poppins" w:eastAsia="Poppins" w:hAnsi="Poppins"/>
@@ -8698,222 +8698,6 @@
                 <w:sz w:val="22"/>
                 <w:szCs w:val="22"/>
               </w:rPr>
-              <w:t xml:space="preserve">Foundation builds</w:t>
-            </w:r>
-          </w:p>
-        </w:tc>
-        <w:tc>
-          <w:tcPr>
-            <w:tcW w:type="dxa" w:w="6026"/>
-            <w:tcBorders>
-              <w:top w:val="single" w:color="D9D9D9" w:sz="4"/>
-              <w:left w:val="single" w:color="D9D9D9" w:sz="4"/>
-              <w:bottom w:val="single" w:color="D9D9D9" w:sz="4"/>
-              <w:right w:val="single" w:color="D9D9D9" w:sz="4"/>
-            </w:tcBorders>
-            <w:tcMar>
-              <w:top w:type="dxa" w:w="80"/>
-              <w:left w:type="dxa" w:w="100"/>
-              <w:bottom w:type="dxa" w:w="80"/>
-              <w:right w:type="dxa" w:w="100"/>
-            </w:tcMar>
-            <w:vAlign w:val="top"/>
-          </w:tcPr>
-          <w:p>
-            <w:pPr>
-              <w:spacing w:after="40" w:line="300"/>
-            </w:pPr>
-            <w:r>
-              <w:rPr>
-                <w:rFonts w:ascii="Poppins" w:cs="Poppins" w:eastAsia="Poppins" w:hAnsi="Poppins"/>
-                <w:color w:val="000000"/>
-                <w:sz w:val="22"/>
-                <w:szCs w:val="22"/>
-              </w:rPr>
-              <w:t xml:space="preserve">Website rebuild with the buy path and proof pages; SEM set-up; trigger-based CRM with segments; three campaign landing pages. $9,250</w:t>
-            </w:r>
-          </w:p>
-        </w:tc>
-      </w:tr>
-      <w:tr>
-        <w:trPr>
-          <w:cantSplit/>
-          <w:tblHeader w:val="false"/>
-        </w:trPr>
-        <w:tc>
-          <w:tcPr>
-            <w:tcW w:type="dxa" w:w="3000"/>
-            <w:tcBorders>
-              <w:top w:val="single" w:color="D9D9D9" w:sz="4"/>
-              <w:left w:val="single" w:color="D9D9D9" w:sz="4"/>
-              <w:bottom w:val="single" w:color="D9D9D9" w:sz="4"/>
-              <w:right w:val="single" w:color="D9D9D9" w:sz="4"/>
-            </w:tcBorders>
-            <w:tcMar>
-              <w:top w:type="dxa" w:w="80"/>
-              <w:left w:type="dxa" w:w="100"/>
-              <w:bottom w:type="dxa" w:w="80"/>
-              <w:right w:type="dxa" w:w="100"/>
-            </w:tcMar>
-            <w:vAlign w:val="top"/>
-          </w:tcPr>
-          <w:p>
-            <w:pPr>
-              <w:spacing w:after="40" w:line="300"/>
-            </w:pPr>
-            <w:r>
-              <w:rPr>
-                <w:rFonts w:ascii="Poppins" w:cs="Poppins" w:eastAsia="Poppins" w:hAnsi="Poppins"/>
-                <w:b/>
-                <w:bCs/>
-                <w:color w:val="000000"/>
-                <w:sz w:val="22"/>
-                <w:szCs w:val="22"/>
-              </w:rPr>
-              <w:t xml:space="preserve">Program design</w:t>
-            </w:r>
-          </w:p>
-        </w:tc>
-        <w:tc>
-          <w:tcPr>
-            <w:tcW w:type="dxa" w:w="6026"/>
-            <w:tcBorders>
-              <w:top w:val="single" w:color="D9D9D9" w:sz="4"/>
-              <w:left w:val="single" w:color="D9D9D9" w:sz="4"/>
-              <w:bottom w:val="single" w:color="D9D9D9" w:sz="4"/>
-              <w:right w:val="single" w:color="D9D9D9" w:sz="4"/>
-            </w:tcBorders>
-            <w:tcMar>
-              <w:top w:type="dxa" w:w="80"/>
-              <w:left w:type="dxa" w:w="100"/>
-              <w:bottom w:type="dxa" w:w="80"/>
-              <w:right w:type="dxa" w:w="100"/>
-            </w:tcMar>
-            <w:vAlign w:val="top"/>
-          </w:tcPr>
-          <w:p>
-            <w:pPr>
-              <w:spacing w:after="40" w:line="300"/>
-            </w:pPr>
-            <w:r>
-              <w:rPr>
-                <w:rFonts w:ascii="Poppins" w:cs="Poppins" w:eastAsia="Poppins" w:hAnsi="Poppins"/>
-                <w:color w:val="000000"/>
-                <w:sz w:val="22"/>
-                <w:szCs w:val="22"/>
-              </w:rPr>
-              <w:t xml:space="preserve">Switcher offer and the partner approach; referral program and Bring a Mate; wholesale structure, pipeline and hire brief; key messaging and the customer journey; the competition and giveaway campaign. $8,500</w:t>
-            </w:r>
-          </w:p>
-        </w:tc>
-      </w:tr>
-      <w:tr>
-        <w:trPr>
-          <w:cantSplit/>
-          <w:tblHeader w:val="false"/>
-        </w:trPr>
-        <w:tc>
-          <w:tcPr>
-            <w:tcW w:type="dxa" w:w="3000"/>
-            <w:tcBorders>
-              <w:top w:val="single" w:color="D9D9D9" w:sz="4"/>
-              <w:left w:val="single" w:color="D9D9D9" w:sz="4"/>
-              <w:bottom w:val="single" w:color="D9D9D9" w:sz="4"/>
-              <w:right w:val="single" w:color="D9D9D9" w:sz="4"/>
-            </w:tcBorders>
-            <w:tcMar>
-              <w:top w:type="dxa" w:w="80"/>
-              <w:left w:type="dxa" w:w="100"/>
-              <w:bottom w:type="dxa" w:w="80"/>
-              <w:right w:type="dxa" w:w="100"/>
-            </w:tcMar>
-            <w:vAlign w:val="top"/>
-          </w:tcPr>
-          <w:p>
-            <w:pPr>
-              <w:spacing w:after="40" w:line="300"/>
-            </w:pPr>
-            <w:r>
-              <w:rPr>
-                <w:rFonts w:ascii="Poppins" w:cs="Poppins" w:eastAsia="Poppins" w:hAnsi="Poppins"/>
-                <w:b/>
-                <w:bCs/>
-                <w:color w:val="000000"/>
-                <w:sz w:val="22"/>
-                <w:szCs w:val="22"/>
-              </w:rPr>
-              <w:t xml:space="preserve">Running the sprint, three months</w:t>
-            </w:r>
-          </w:p>
-        </w:tc>
-        <w:tc>
-          <w:tcPr>
-            <w:tcW w:type="dxa" w:w="6026"/>
-            <w:tcBorders>
-              <w:top w:val="single" w:color="D9D9D9" w:sz="4"/>
-              <w:left w:val="single" w:color="D9D9D9" w:sz="4"/>
-              <w:bottom w:val="single" w:color="D9D9D9" w:sz="4"/>
-              <w:right w:val="single" w:color="D9D9D9" w:sz="4"/>
-            </w:tcBorders>
-            <w:tcMar>
-              <w:top w:type="dxa" w:w="80"/>
-              <w:left w:type="dxa" w:w="100"/>
-              <w:bottom w:type="dxa" w:w="80"/>
-              <w:right w:type="dxa" w:w="100"/>
-            </w:tcMar>
-            <w:vAlign w:val="top"/>
-          </w:tcPr>
-          <w:p>
-            <w:pPr>
-              <w:spacing w:after="40" w:line="300"/>
-            </w:pPr>
-            <w:r>
-              <w:rPr>
-                <w:rFonts w:ascii="Poppins" w:cs="Poppins" w:eastAsia="Poppins" w:hAnsi="Poppins"/>
-                <w:color w:val="000000"/>
-                <w:sz w:val="22"/>
-                <w:szCs w:val="22"/>
-              </w:rPr>
-              <w:t xml:space="preserve">SEM and Meta management; JVP, partner and wholesale outreach; content and campaign artwork; the weekly and monthly rhythm and the report. $3,250 a month, $9,750</w:t>
-            </w:r>
-          </w:p>
-        </w:tc>
-      </w:tr>
-      <w:tr>
-        <w:trPr>
-          <w:cantSplit/>
-          <w:tblHeader w:val="false"/>
-        </w:trPr>
-        <w:tc>
-          <w:tcPr>
-            <w:tcW w:type="dxa" w:w="3000"/>
-            <w:tcBorders>
-              <w:top w:val="single" w:color="D9D9D9" w:sz="4"/>
-              <w:left w:val="single" w:color="D9D9D9" w:sz="4"/>
-              <w:bottom w:val="single" w:color="D9D9D9" w:sz="4"/>
-              <w:right w:val="single" w:color="D9D9D9" w:sz="4"/>
-            </w:tcBorders>
-            <w:tcMar>
-              <w:top w:type="dxa" w:w="80"/>
-              <w:left w:type="dxa" w:w="100"/>
-              <w:bottom w:type="dxa" w:w="80"/>
-              <w:right w:type="dxa" w:w="100"/>
-            </w:tcMar>
-            <w:vAlign w:val="top"/>
-          </w:tcPr>
-          <w:p>
-            <w:pPr>
-              <w:spacing w:after="40" w:line="300"/>
-            </w:pPr>
-            <w:r>
-              <w:rPr>
-                <w:rFonts w:ascii="Poppins" w:cs="Poppins" w:eastAsia="Poppins" w:hAnsi="Poppins"/>
-                <w:b/>
-                <w:bCs/>
-                <w:color w:val="000000"/>
-                <w:sz w:val="22"/>
-                <w:szCs w:val="22"/>
-              </w:rPr>
               <w:t xml:space="preserve">Option A total</w:t>
             </w:r>
           </w:p>
@@ -8974,7 +8758,7 @@
           <w:sz w:val="22"/>
           <w:szCs w:val="22"/>
         </w:rPr>
-        <w:t xml:space="preserve">Payment: $25,000 on acceptance, or $8,333 a month across the three months. Stop or continue at the mid-December review. The line fees above are the standard rate and sum to $27,500; the discount is applied to the total.</w:t>
+        <w:t xml:space="preserve">Payment: $25,000 on acceptance, or $8,333 a month across the three months. Stop or continue at the mid-December review. Inclusions to be confirmed.</w:t>
       </w:r>
     </w:p>
     <w:p>
@@ -9119,150 +8903,6 @@
                 <w:sz w:val="22"/>
                 <w:szCs w:val="22"/>
               </w:rPr>
-              <w:t xml:space="preserve">Everything in Option A</w:t>
-            </w:r>
-          </w:p>
-        </w:tc>
-        <w:tc>
-          <w:tcPr>
-            <w:tcW w:type="dxa" w:w="6026"/>
-            <w:tcBorders>
-              <w:top w:val="single" w:color="D9D9D9" w:sz="4"/>
-              <w:left w:val="single" w:color="D9D9D9" w:sz="4"/>
-              <w:bottom w:val="single" w:color="D9D9D9" w:sz="4"/>
-              <w:right w:val="single" w:color="D9D9D9" w:sz="4"/>
-            </w:tcBorders>
-            <w:tcMar>
-              <w:top w:type="dxa" w:w="80"/>
-              <w:left w:type="dxa" w:w="100"/>
-              <w:bottom w:type="dxa" w:w="80"/>
-              <w:right w:type="dxa" w:w="100"/>
-            </w:tcMar>
-            <w:vAlign w:val="top"/>
-          </w:tcPr>
-          <w:p>
-            <w:pPr>
-              <w:spacing w:after="40" w:line="300"/>
-            </w:pPr>
-            <w:r>
-              <w:rPr>
-                <w:rFonts w:ascii="Poppins" w:cs="Poppins" w:eastAsia="Poppins" w:hAnsi="Poppins"/>
-                <w:color w:val="000000"/>
-                <w:sz w:val="22"/>
-                <w:szCs w:val="22"/>
-              </w:rPr>
-              <w:t xml:space="preserve">Delivered in the first three months. Included.</w:t>
-            </w:r>
-          </w:p>
-        </w:tc>
-      </w:tr>
-      <w:tr>
-        <w:trPr>
-          <w:cantSplit/>
-          <w:tblHeader w:val="false"/>
-        </w:trPr>
-        <w:tc>
-          <w:tcPr>
-            <w:tcW w:type="dxa" w:w="3000"/>
-            <w:tcBorders>
-              <w:top w:val="single" w:color="D9D9D9" w:sz="4"/>
-              <w:left w:val="single" w:color="D9D9D9" w:sz="4"/>
-              <w:bottom w:val="single" w:color="D9D9D9" w:sz="4"/>
-              <w:right w:val="single" w:color="D9D9D9" w:sz="4"/>
-            </w:tcBorders>
-            <w:tcMar>
-              <w:top w:type="dxa" w:w="80"/>
-              <w:left w:type="dxa" w:w="100"/>
-              <w:bottom w:type="dxa" w:w="80"/>
-              <w:right w:type="dxa" w:w="100"/>
-            </w:tcMar>
-            <w:vAlign w:val="top"/>
-          </w:tcPr>
-          <w:p>
-            <w:pPr>
-              <w:spacing w:after="40" w:line="300"/>
-            </w:pPr>
-            <w:r>
-              <w:rPr>
-                <w:rFonts w:ascii="Poppins" w:cs="Poppins" w:eastAsia="Poppins" w:hAnsi="Poppins"/>
-                <w:b/>
-                <w:bCs/>
-                <w:color w:val="000000"/>
-                <w:sz w:val="22"/>
-                <w:szCs w:val="22"/>
-              </w:rPr>
-              <w:t xml:space="preserve">Months four to twelve</w:t>
-            </w:r>
-          </w:p>
-        </w:tc>
-        <w:tc>
-          <w:tcPr>
-            <w:tcW w:type="dxa" w:w="6026"/>
-            <w:tcBorders>
-              <w:top w:val="single" w:color="D9D9D9" w:sz="4"/>
-              <w:left w:val="single" w:color="D9D9D9" w:sz="4"/>
-              <w:bottom w:val="single" w:color="D9D9D9" w:sz="4"/>
-              <w:right w:val="single" w:color="D9D9D9" w:sz="4"/>
-            </w:tcBorders>
-            <w:tcMar>
-              <w:top w:type="dxa" w:w="80"/>
-              <w:left w:type="dxa" w:w="100"/>
-              <w:bottom w:type="dxa" w:w="80"/>
-              <w:right w:type="dxa" w:w="100"/>
-            </w:tcMar>
-            <w:vAlign w:val="top"/>
-          </w:tcPr>
-          <w:p>
-            <w:pPr>
-              <w:spacing w:after="40" w:line="300"/>
-            </w:pPr>
-            <w:r>
-              <w:rPr>
-                <w:rFonts w:ascii="Poppins" w:cs="Poppins" w:eastAsia="Poppins" w:hAnsi="Poppins"/>
-                <w:color w:val="000000"/>
-                <w:sz w:val="22"/>
-                <w:szCs w:val="22"/>
-              </w:rPr>
-              <w:t xml:space="preserve">The weddings and functions program; party rental reworked, and the membership redesign when you release it; range and hero product marketing; club and venue offers; SEM, outreach, content and artwork continuing; the reviews at March and September. Included.</w:t>
-            </w:r>
-          </w:p>
-        </w:tc>
-      </w:tr>
-      <w:tr>
-        <w:trPr>
-          <w:cantSplit/>
-          <w:tblHeader w:val="false"/>
-        </w:trPr>
-        <w:tc>
-          <w:tcPr>
-            <w:tcW w:type="dxa" w:w="3000"/>
-            <w:tcBorders>
-              <w:top w:val="single" w:color="D9D9D9" w:sz="4"/>
-              <w:left w:val="single" w:color="D9D9D9" w:sz="4"/>
-              <w:bottom w:val="single" w:color="D9D9D9" w:sz="4"/>
-              <w:right w:val="single" w:color="D9D9D9" w:sz="4"/>
-            </w:tcBorders>
-            <w:tcMar>
-              <w:top w:type="dxa" w:w="80"/>
-              <w:left w:type="dxa" w:w="100"/>
-              <w:bottom w:type="dxa" w:w="80"/>
-              <w:right w:type="dxa" w:w="100"/>
-            </w:tcMar>
-            <w:vAlign w:val="top"/>
-          </w:tcPr>
-          <w:p>
-            <w:pPr>
-              <w:spacing w:after="40" w:line="300"/>
-            </w:pPr>
-            <w:r>
-              <w:rPr>
-                <w:rFonts w:ascii="Poppins" w:cs="Poppins" w:eastAsia="Poppins" w:hAnsi="Poppins"/>
-                <w:b/>
-                <w:bCs/>
-                <w:color w:val="000000"/>
-                <w:sz w:val="22"/>
-                <w:szCs w:val="22"/>
-              </w:rPr>
               <w:t xml:space="preserve">Option B total</w:t>
             </w:r>
           </w:p>
@@ -9323,7 +8963,7 @@
           <w:sz w:val="22"/>
           <w:szCs w:val="22"/>
         </w:rPr>
-        <w:t xml:space="preserve">Payment: monthly in advance. Minimum three months, then stop at any review with a month’s notice.</w:t>
+        <w:t xml:space="preserve">Payment: monthly in advance. Minimum three months, then stop at any review with a month’s notice. Inclusions to be confirmed.</w:t>
       </w:r>
     </w:p>
     <w:p>

</xml_diff>